<commit_message>
Fix duplicate citation and regenerate IJHPM package
Co-Authored-By: Tatsuki Onishi <bougtoir@gmail.com>
</commit_message>
<xml_diff>
--- a/documents/IJHPM/regional_anaesthesia_IJHPM_EN.docx
+++ b/documents/IJHPM/regional_anaesthesia_IJHPM_EN.docx
@@ -2923,14 +2923,6 @@
         </w:rPr>
         <w:t xml:space="preserve"> aligned with international standards for safe practice of anaesthesia.</w:t>
       </w:r>
-      <w:r>
-        <w:rPr>
-          <w:rFonts w:ascii="Times New Roman" w:hAnsi="Times New Roman"/>
-          <w:sz w:val="24"/>
-          <w:vertAlign w:val="superscript"/>
-        </w:rPr>
-        <w:t>28</w:t>
-      </w:r>
     </w:p>
     <w:p>
       <w:r>

</xml_diff>

<commit_message>
IJHPM: derive audit bound from SSK data, fix refs, remove hardcoded literals
Co-Authored-By: Tatsuki Onishi <bougtoir@gmail.com>
</commit_message>
<xml_diff>
--- a/documents/IJHPM/regional_anaesthesia_IJHPM_EN.docx
+++ b/documents/IJHPM/regional_anaesthesia_IJHPM_EN.docx
@@ -82,7 +82,7 @@
           <w:i/>
           <w:sz w:val="24"/>
         </w:rPr>
-        <w:t>Word count (main text, excluding abstract, references, tables and figures): approximately 3450 words</w:t>
+        <w:t>Word count (main text, excluding abstract, references, tables and figures): approximately 3462 words</w:t>
       </w:r>
     </w:p>
     <w:p>
@@ -148,7 +148,7 @@
           <w:rFonts w:ascii="Times New Roman" w:hAnsi="Times New Roman"/>
           <w:sz w:val="24"/>
         </w:rPr>
-        <w:t>2. The four- to eight-fold variation in neuraxial and combined general-epidural anaesthesia is a modifiable equity gap that workforce, training and monitoring policies can address without changing payment rates.</w:t>
+        <w:t>2. Large variation in neuraxial and combined general-epidural anaesthesia is a modifiable equity gap that workforce, training and monitoring policies can address without changing payment rates.</w:t>
       </w:r>
     </w:p>
     <w:p>
@@ -260,7 +260,7 @@
           <w:rFonts w:ascii="Times New Roman" w:hAnsi="Times New Roman"/>
           <w:sz w:val="24"/>
         </w:rPr>
-        <w:t>Results  Coefficients of variation ranged from 53.7% (general anaesthesia) to 87.2% (epidural). Only 0.058 of general anaesthesia variance lay between prefectures; university hospital presence explained 0.358 of total variance and 47.4% of within-prefecture variance (Cohen's d 1.88), and was positive in all 47 prefectures. Audit sensitivity analyses converged: the maximum audit-rate difference could shift ratios by at most 0.21 points, less than 0.4% of the interquartile range for general anaesthesia. Empirical Bayes shrinkage attenuated the university hospital effect but it remained statistically significant.</w:t>
+        <w:t>Results  Coefficients of variation ranged from 53.7% (general anaesthesia) to 87.2% (epidural). Only 0.058 of general anaesthesia variance lay between prefectures; university hospital presence explained 0.358 of total variance and 47.4% of within-prefecture variance (Cohen's d 1.88), and was positive in all 47 prefectures. Audit sensitivity analyses converged: the maximum audit-rate difference could shift ratios by at most 0.28 points, less than 1% of the interquartile range for general anaesthesia. Empirical Bayes shrinkage attenuated the university hospital effect but it remained statistically significant.</w:t>
       </w:r>
     </w:p>
     <w:p>
@@ -364,7 +364,7 @@
           <w:rFonts w:ascii="Times New Roman" w:hAnsi="Times New Roman"/>
           <w:sz w:val="24"/>
         </w:rPr>
-        <w:t xml:space="preserve"> Cross-boundary patient movement is limited: only 6.1% of inpatients receive care outside their home prefecture.</w:t>
+        <w:t xml:space="preserve"> Cross-boundary patient movement is limited,</w:t>
       </w:r>
       <w:r>
         <w:rPr>
@@ -379,7 +379,7 @@
           <w:rFonts w:ascii="Times New Roman" w:hAnsi="Times New Roman"/>
           <w:sz w:val="24"/>
         </w:rPr>
-        <w:t xml:space="preserve"> The system was intended to ensure equitable access regardless of geography.</w:t>
+        <w:t xml:space="preserve"> and the system was intended to ensure equitable access regardless of geography.</w:t>
       </w:r>
     </w:p>
     <w:p>
@@ -457,7 +457,7 @@
           <w:rFonts w:ascii="Times New Roman" w:hAnsi="Times New Roman"/>
           <w:sz w:val="24"/>
         </w:rPr>
-        <w:t xml:space="preserve"> The 2026 revision of the Japanese fee schedule renamed the general anaesthesia code to clarify longstanding ambiguity in airway definitions, an ambiguity that could plausibly have driven differential audit decisions.</w:t>
+        <w:t xml:space="preserve"> The 2026 revision of the Japanese fee schedule renamed and redefined the L008 general-anaesthesia code to make the required airway-device explicit, removing an ambiguity that could plausibly have driven differential audit decisions.</w:t>
       </w:r>
       <w:r>
         <w:rPr>
@@ -524,7 +524,7 @@
           <w:sz w:val="24"/>
           <w:vertAlign w:val="superscript"/>
         </w:rPr>
-        <w:t>30</w:t>
+        <w:t>11</w:t>
       </w:r>
       <w:r>
         <w:rPr>
@@ -576,7 +576,7 @@
           <w:sz w:val="24"/>
           <w:vertAlign w:val="superscript"/>
         </w:rPr>
-        <w:t>11</w:t>
+        <w:t>12</w:t>
       </w:r>
       <w:r>
         <w:rPr>
@@ -613,7 +613,7 @@
           <w:sz w:val="24"/>
           <w:vertAlign w:val="superscript"/>
         </w:rPr>
-        <w:t>12</w:t>
+        <w:t>13</w:t>
       </w:r>
       <w:r>
         <w:rPr>
@@ -628,7 +628,7 @@
           <w:sz w:val="24"/>
           <w:vertAlign w:val="superscript"/>
         </w:rPr>
-        <w:t>13</w:t>
+        <w:t>14</w:t>
       </w:r>
       <w:r>
         <w:rPr>
@@ -643,7 +643,7 @@
           <w:sz w:val="24"/>
           <w:vertAlign w:val="superscript"/>
         </w:rPr>
-        <w:t>14</w:t>
+        <w:t>15</w:t>
       </w:r>
     </w:p>
     <w:p>
@@ -1065,7 +1065,7 @@
           <w:sz w:val="24"/>
           <w:vertAlign w:val="superscript"/>
         </w:rPr>
-        <w:t>15</w:t>
+        <w:t>16</w:t>
       </w:r>
       <w:r>
         <w:rPr>
@@ -1080,7 +1080,7 @@
           <w:sz w:val="24"/>
           <w:vertAlign w:val="superscript"/>
         </w:rPr>
-        <w:t>16</w:t>
+        <w:t>17</w:t>
       </w:r>
       <w:r>
         <w:rPr>
@@ -1095,14 +1095,14 @@
           <w:sz w:val="24"/>
           <w:vertAlign w:val="superscript"/>
         </w:rPr>
-        <w:t>17</w:t>
+        <w:t>18</w:t>
       </w:r>
       <w:r>
         <w:rPr>
           <w:rFonts w:ascii="Times New Roman" w:hAnsi="Times New Roman"/>
           <w:sz w:val="24"/>
         </w:rPr>
-        <w:t xml:space="preserve"> Marginal R² was calculated as the proportional reduction in total variance from the null model. To address potential instability of ratios in low-volume areas, we applied empirical Bayes shrinkage estimation</w:t>
+        <w:t xml:space="preserve"> A small number of model fits produced optimizer convergence warnings; the resulting point estimates were numerically stable across repeated fits and across the three sensitivity analyses, and are reported as mixed-model coefficients. Marginal R² was calculated as the proportional reduction in total variance from the null model. To address potential instability of ratios in low-volume areas, we applied empirical Bayes shrinkage estimation</w:t>
       </w:r>
       <w:r>
         <w:rPr>
@@ -1110,7 +1110,7 @@
           <w:sz w:val="24"/>
           <w:vertAlign w:val="superscript"/>
         </w:rPr>
-        <w:t>18</w:t>
+        <w:t>19</w:t>
       </w:r>
       <w:r>
         <w:rPr>
@@ -1126,7 +1126,22 @@
           <w:rFonts w:ascii="Times New Roman" w:hAnsi="Times New Roman"/>
           <w:sz w:val="24"/>
         </w:rPr>
-        <w:t>Third, three pre-specified sensitivity analyses tested the null hypothesis that insurance auditing explains observed variation. (a) Within-prefecture variance decomposition: under uniform prefectural auditing, within-prefecture variance should be small. We decomposed total variance using one-way analysis of variance and further partitioned the within-prefecture component into university hospital effect and residual using hierarchical sum-of-squares decomposition. (b) Cross-code correlation: audit-driven reclassification between general and spinal anaesthesia codes would produce negative correlations between them. (c) Quantitative audit-impact estimation: we calculated the maximum ratio shift attributable to the observed range of prefectural audit rates. Combined ratios (general plus continuous epidural; general plus spinal) were also examined, since combining substitutable codes should largely absorb any audit-driven reclassification. Patients were not involved in the design, conduct or reporting of this study.</w:t>
+        <w:t>Third, three pre-specified sensitivity analyses tested the null hypothesis that insurance auditing explains observed variation. (a) Within-prefecture variance decomposition: under uniform prefectural auditing, within-prefecture variance should be small. We decomposed total variance using one-way analysis of variance and further partitioned the within-prefecture component into university hospital effect and residual using hierarchical sum-of-squares decomposition. (b) Cross-code correlation: audit-driven reclassification between general and spinal anaesthesia codes would produce negative correlations between them. (c) Quantitative audit-impact estimation: we calculated the maximum ratio shift attributable to the observed range of prefectural point-audit rates reported by the Social Insurance Medical Fee Payment Fund.</w:t>
+      </w:r>
+      <w:r>
+        <w:rPr>
+          <w:rFonts w:ascii="Times New Roman" w:hAnsi="Times New Roman"/>
+          <w:sz w:val="24"/>
+          <w:vertAlign w:val="superscript"/>
+        </w:rPr>
+        <w:t>6</w:t>
+      </w:r>
+      <w:r>
+        <w:rPr>
+          <w:rFonts w:ascii="Times New Roman" w:hAnsi="Times New Roman"/>
+          <w:sz w:val="24"/>
+        </w:rPr>
+        <w:t xml:space="preserve"> Combined ratios (general plus continuous epidural; general plus spinal) were also examined, since combining substitutable codes should largely absorb any audit-driven reclassification. Patients were not involved in the design, conduct or reporting of this study.</w:t>
       </w:r>
     </w:p>
     <w:p>
@@ -2547,7 +2562,7 @@
           <w:rFonts w:ascii="Times New Roman" w:hAnsi="Times New Roman"/>
           <w:sz w:val="24"/>
         </w:rPr>
-        <w:t>All three pre-specified sensitivity analyses converged in rejecting the audit hypothesis. First, within-prefecture variance decomposition attributed 14.5% of general anaesthesia variance to between-prefecture differences, 40.5% to the university hospital effect within prefecture, and 45.0% to residual within-group variation; the university hospital effect alone explained 47.4% of all within-prefecture variance. Second, general and spinal anaesthesia were positively, not negatively, correlated (r = 0.235, P &lt;0.001), as were general and epidural anaesthesia (r = 0.319, P &lt;0.001), inconsistent with audit-driven reclassification and consistent with a common supply factor. Third, the maximum prefectural audit-rate difference of 0.21 percentage points could produce a ratio shift of approximately 0.21 points, which is less than 0.4% of the observed interquartile range for general anaesthesia and 0.2% for epidural anaesthesia. Combining general (L008) and spinal (L004) ratios produced an alternative audit-insensitive measure with a coefficient of variation of 43.4% and a university hospital effect that remained large (Cohen's d 1.26), confirming that the structural effect is not artefactually erased by combining reclassifiable codes.</w:t>
+        <w:t>All three pre-specified sensitivity analyses converged in rejecting the audit hypothesis. First, within-prefecture variance decomposition attributed 14.5% of general anaesthesia variance to between-prefecture differences, 40.5% to the university hospital effect within prefecture, and 45.0% to residual within-group variation; the university hospital effect alone explained 47.4% of all within-prefecture variance. Second, general and spinal anaesthesia were positively, not negatively, correlated (r = 0.235, P &lt;0.001), as were general and epidural anaesthesia (r = 0.319, P &lt;0.001), inconsistent with audit-driven reclassification and consistent with a common supply factor. Third, the maximum prefectural audit-rate difference of 0.28 percentage points could produce a ratio shift of approximately 0.28 points, equivalent to approximately 0.53% of the observed interquartile range for general anaesthesia and 0.27% for epidural anaesthesia. Combining general (L008) and spinal (L004) ratios produced an alternative audit-insensitive measure with a coefficient of variation of 43.4% and a university hospital effect that remained large (Cohen's d 1.26), confirming that the structural effect is not artefactually erased by combining reclassifiable codes.</w:t>
       </w:r>
     </w:p>
     <w:p>
@@ -2634,7 +2649,7 @@
           <w:sz w:val="24"/>
           <w:vertAlign w:val="superscript"/>
         </w:rPr>
-        <w:t>19</w:t>
+        <w:t>20</w:t>
       </w:r>
       <w:r>
         <w:rPr>
@@ -2671,7 +2686,7 @@
           <w:sz w:val="24"/>
           <w:vertAlign w:val="superscript"/>
         </w:rPr>
-        <w:t>20</w:t>
+        <w:t>21</w:t>
       </w:r>
       <w:r>
         <w:rPr>
@@ -2686,7 +2701,7 @@
           <w:sz w:val="24"/>
           <w:vertAlign w:val="superscript"/>
         </w:rPr>
-        <w:t>21</w:t>
+        <w:t>22</w:t>
       </w:r>
       <w:r>
         <w:rPr>
@@ -2701,7 +2716,7 @@
           <w:sz w:val="24"/>
           <w:vertAlign w:val="superscript"/>
         </w:rPr>
-        <w:t>22</w:t>
+        <w:t>23</w:t>
       </w:r>
       <w:r>
         <w:rPr>
@@ -2716,14 +2731,14 @@
           <w:sz w:val="24"/>
           <w:vertAlign w:val="superscript"/>
         </w:rPr>
-        <w:t>23</w:t>
+        <w:t>24</w:t>
       </w:r>
       <w:r>
         <w:rPr>
           <w:rFonts w:ascii="Times New Roman" w:hAnsi="Times New Roman"/>
           <w:sz w:val="24"/>
         </w:rPr>
-        <w:t xml:space="preserve"> Our study extends this evidence by exploiting Japan's uniquely uniform fee schedule combined with prefecture-specific auditing to disentangle administrative and clinical sources of variation, and by providing the first multilevel small-area analysis of anaesthesia technique under universal coverage in East Asia. The university hospital effect we report (Cohen's d = 1.88) is unusually large compared with effect sizes typically reported in this literature, plausibly reflecting the influence of the ikyoku (university medical office) system on clinical practice in affiliated hospitals.</w:t>
+        <w:t xml:space="preserve"> Our study extends this evidence by exploiting Japan's uniquely uniform fee schedule combined with prefecture-specific auditing to disentangle administrative and clinical sources of variation, and by providing, to our knowledge, the first multilevel small-area analysis of anaesthesia technique under universal coverage in East Asia. The university hospital effect we report (Cohen's d = 1.88) is substantial, plausibly reflecting the influence of the ikyoku (university medical office) system on clinical practice in affiliated hospitals.</w:t>
       </w:r>
       <w:r>
         <w:rPr>
@@ -2731,29 +2746,14 @@
           <w:sz w:val="24"/>
           <w:vertAlign w:val="superscript"/>
         </w:rPr>
-        <w:t>24</w:t>
+        <w:t>25</w:t>
       </w:r>
       <w:r>
         <w:rPr>
           <w:rFonts w:ascii="Times New Roman" w:hAnsi="Times New Roman"/>
           <w:sz w:val="24"/>
         </w:rPr>
-        <w:t xml:space="preserve"> The intraclass correlation coefficient of 0.058 for general anaesthesia is also noticeably lower than coefficients reported for surgical procedure rates in the United States,</w:t>
-      </w:r>
-      <w:r>
-        <w:rPr>
-          <w:rFonts w:ascii="Times New Roman" w:hAnsi="Times New Roman"/>
-          <w:sz w:val="24"/>
-          <w:vertAlign w:val="superscript"/>
-        </w:rPr>
-        <w:t>20</w:t>
-      </w:r>
-      <w:r>
-        <w:rPr>
-          <w:rFonts w:ascii="Times New Roman" w:hAnsi="Times New Roman"/>
-          <w:sz w:val="24"/>
-        </w:rPr>
-        <w:t xml:space="preserve"> indicating that within-prefecture institutional factors dominate over prefectural-level factors for this code.</w:t>
+        <w:t xml:space="preserve"> The intraclass correlation coefficient of 0.058 for general anaesthesia indicates that most variation occurs within prefectures, consistent with institutional factors dominating over prefectural-level factors for this code.</w:t>
       </w:r>
     </w:p>
     <w:p>
@@ -2770,7 +2770,7 @@
           <w:sz w:val="24"/>
           <w:vertAlign w:val="superscript"/>
         </w:rPr>
-        <w:t>25</w:t>
+        <w:t>26</w:t>
       </w:r>
       <w:r>
         <w:rPr>
@@ -2785,7 +2785,7 @@
           <w:sz w:val="24"/>
           <w:vertAlign w:val="superscript"/>
         </w:rPr>
-        <w:t>21,22</w:t>
+        <w:t>22,23</w:t>
       </w:r>
       <w:r>
         <w:rPr>
@@ -2800,7 +2800,7 @@
           <w:sz w:val="24"/>
           <w:vertAlign w:val="superscript"/>
         </w:rPr>
-        <w:t>20,21</w:t>
+        <w:t>21,22</w:t>
       </w:r>
       <w:r>
         <w:rPr>
@@ -2815,7 +2815,7 @@
           <w:sz w:val="24"/>
           <w:vertAlign w:val="superscript"/>
         </w:rPr>
-        <w:t>26</w:t>
+        <w:t>27</w:t>
       </w:r>
       <w:r>
         <w:rPr>
@@ -2845,7 +2845,7 @@
           <w:sz w:val="24"/>
           <w:vertAlign w:val="superscript"/>
         </w:rPr>
-        <w:t>27,28</w:t>
+        <w:t>28,29</w:t>
       </w:r>
       <w:r>
         <w:rPr>
@@ -2882,7 +2882,7 @@
           <w:rFonts w:ascii="Times New Roman" w:hAnsi="Times New Roman"/>
           <w:sz w:val="24"/>
         </w:rPr>
-        <w:t>The policy implications of these findings are threefold. First, the predominance of structural over administrative determinants means that regulators should not interpret regional variation in anaesthesia claims as prima facie evidence of differential coding accuracy or fraud. Japan's prefecture-specific auditing system is an important governance tool, but its variation in intensity is too small to explain the observed four- to eight-fold differences in neuraxial technique use. Redirecting enforcement resources toward coding audits in low-ratio areas is unlikely to reduce the gap and may even penalise providers who already lack specialist capacity.</w:t>
+        <w:t>The policy implications of these findings are threefold. First, the predominance of structural over administrative determinants means that regulators should not interpret regional variation in anaesthesia claims as prima facie evidence of differential coding accuracy or fraud. Japan's prefecture-specific auditing system is an important governance tool, but its variation in intensity is too small to explain the observed large differences in neuraxial technique use. Redirecting enforcement resources toward coding audits in low-ratio areas is unlikely to reduce the gap and may even penalise providers who already lack specialist capacity.</w:t>
       </w:r>
     </w:p>
     <w:p>
@@ -2914,7 +2914,7 @@
           <w:sz w:val="24"/>
           <w:vertAlign w:val="superscript"/>
         </w:rPr>
-        <w:t>27-29</w:t>
+        <w:t>28-30</w:t>
       </w:r>
       <w:r>
         <w:rPr>
@@ -2952,7 +2952,7 @@
           <w:rFonts w:ascii="Times New Roman" w:hAnsi="Times New Roman"/>
           <w:sz w:val="24"/>
         </w:rPr>
-        <w:t>Regional variation in anaesthesia practice in Japan is large and predominantly structural rather than an artefact of insurance auditing. University hospital presence is the dominant determinant, explaining more than one third of total variance in general anaesthesia. The variation in epidural anaesthesia (L002) and continuous epidural infusion (L003) is of particular concern given emerging evidence of oncological benefit from regional techniques. Quality improvement, workforce policy and equity policy should address the supply and organisational determinants of anaesthesia practice rather than treat the variation as an unavoidable feature of claims processing or as a signal of differential auditing.</w:t>
+        <w:t>Regional variation in anaesthesia practice in Japan is large and predominantly structural rather than an artefact of insurance auditing. University hospital presence is the dominant measured structural determinant, explaining more than one third of total variance in general anaesthesia. The variation in epidural anaesthesia (L002) and continuous epidural infusion (L003) is of particular concern given emerging evidence of oncological benefit from regional techniques. Quality improvement, workforce policy and equity policy should address the supply and organisational determinants of anaesthesia practice rather than treat the variation as an unavoidable feature of claims processing or as a signal of differential auditing.</w:t>
       </w:r>
     </w:p>
     <w:p>
@@ -3079,7 +3079,7 @@
           <w:rFonts w:ascii="Times New Roman" w:hAnsi="Times New Roman"/>
           <w:sz w:val="24"/>
         </w:rPr>
-        <w:t>Cabinet Office. Indicators of regional variation in healthcare and long-term care: insurance auditing rates by prefecture. Tokyo: Cabinet Office, 2023.</w:t>
+        <w:t>Social Insurance Medical Fee Payment Fund. 審査状況（令和4年度）— 都道府県別医科歯科計審査状況（点数）. Tokyo: Social Insurance Medical Fee Payment Fund, 2023. https://www.ssk.or.jp/smph/tokeijoho/shinsatokei/shinsajokyo_r04.html (accessed 24 Jul 2026).</w:t>
       </w:r>
     </w:p>
     <w:p>
@@ -3155,7 +3155,7 @@
           <w:rFonts w:ascii="Times New Roman" w:hAnsi="Times New Roman"/>
           <w:sz w:val="24"/>
         </w:rPr>
-        <w:t>Ministry of Health, Labour and Welfare. 2026 revision of the medical fee schedule: notice on anaesthesia code revisions. Tokyo: MHLW, 2025.</w:t>
+        <w:t>Ministry of Health, Labour and Welfare. 2026 revision of the medical fee schedule: changes to the medical fee schedule master (R08). Tokyo: MHLW, 2026. https://shinryohoshu.mhlw.go.jp/shinryohoshu/file/info/smente260522.pdf (accessed 24 Jul 2026).</w:t>
       </w:r>
     </w:p>
     <w:p>
@@ -3174,7 +3174,7 @@
           <w:rFonts w:ascii="Times New Roman" w:hAnsi="Times New Roman"/>
           <w:sz w:val="24"/>
         </w:rPr>
-        <w:t>Wennberg JE, Cooper MM, eds. The Dartmouth Atlas of Health Care. Chicago: American Hospital Publishing, 1999.</w:t>
+        <w:t>von Elm E, Altman DG, Egger M, et al. The Strengthening the Reporting of Observational Studies in Epidemiology (STROBE) statement: guidelines for reporting observational studies. Lancet 2007;370:1453-7.</w:t>
       </w:r>
     </w:p>
     <w:p>
@@ -3193,7 +3193,7 @@
           <w:rFonts w:ascii="Times New Roman" w:hAnsi="Times New Roman"/>
           <w:sz w:val="24"/>
         </w:rPr>
-        <w:t>Cabinet Office. Regional variation visualisation (chiikisa no mieruka). https://www5.cao.go.jp/keizai-shimon/kaigi/special/reform/mieruka/ (accessed 10 Mar 2026).</w:t>
+        <w:t>Wennberg JE, Cooper MM, eds. The Dartmouth Atlas of Health Care. Chicago: American Hospital Publishing, 1999.</w:t>
       </w:r>
     </w:p>
     <w:p>
@@ -3212,7 +3212,7 @@
           <w:rFonts w:ascii="Times New Roman" w:hAnsi="Times New Roman"/>
           <w:sz w:val="24"/>
         </w:rPr>
-        <w:t>Ministry of Health, Labour and Welfare. Survey of Physicians, Dentists and Pharmacists 2022 (e-Stat). https://www.e-stat.go.jp (accessed 12 Mar 2026).</w:t>
+        <w:t>Cabinet Office. Regional variation visualisation (chiikisa no mieruka). https://www5.cao.go.jp/keizai-shimon/kaigi/special/reform/mieruka/chiikisa/index.html (accessed 10 Mar 2026).</w:t>
       </w:r>
     </w:p>
     <w:p>
@@ -3231,7 +3231,7 @@
           <w:rFonts w:ascii="Times New Roman" w:hAnsi="Times New Roman"/>
           <w:sz w:val="24"/>
         </w:rPr>
-        <w:t>Ministry of Land, Infrastructure, Transport and Tourism. National Land Numerical Information download service. https://nlftp.mlit.go.jp (accessed 10 Mar 2026).</w:t>
+        <w:t>Ministry of Health, Labour and Welfare. Survey of Physicians, Dentists and Pharmacists 2022 (e-Stat). https://www.e-stat.go.jp (accessed 12 Mar 2026).</w:t>
       </w:r>
     </w:p>
     <w:p>
@@ -3250,7 +3250,7 @@
           <w:rFonts w:ascii="Times New Roman" w:hAnsi="Times New Roman"/>
           <w:sz w:val="24"/>
         </w:rPr>
-        <w:t>Cohen J. Statistical Power Analysis for the Behavioral Sciences. 2nd ed. Hillsdale, NJ: Lawrence Erlbaum, 1988.</w:t>
+        <w:t>Ministry of Land, Infrastructure, Transport and Tourism. National Land Numerical Information download service. https://nlftp.mlit.go.jp (accessed 10 Mar 2026).</w:t>
       </w:r>
     </w:p>
     <w:p>
@@ -3269,7 +3269,7 @@
           <w:rFonts w:ascii="Times New Roman" w:hAnsi="Times New Roman"/>
           <w:sz w:val="24"/>
         </w:rPr>
-        <w:t>Rabe-Hesketh S, Skrondal A. Multilevel and Longitudinal Modeling Using Stata. 3rd ed. College Station, TX: Stata Press, 2012.</w:t>
+        <w:t>Cohen J. Statistical Power Analysis for the Behavioral Sciences. 2nd ed. Hillsdale, NJ: Lawrence Erlbaum, 1988.</w:t>
       </w:r>
     </w:p>
     <w:p>
@@ -3288,7 +3288,7 @@
           <w:rFonts w:ascii="Times New Roman" w:hAnsi="Times New Roman"/>
           <w:sz w:val="24"/>
         </w:rPr>
-        <w:t>Seabold S, Perktold J. Statsmodels: econometric and statistical modeling with Python. In: Proceedings of the 9th Python in Science Conference. 2010:92-6.</w:t>
+        <w:t>Rabe-Hesketh S, Skrondal A. Multilevel and Longitudinal Modeling Using Stata. 3rd ed. College Station, TX: Stata Press, 2012.</w:t>
       </w:r>
     </w:p>
     <w:p>
@@ -3307,7 +3307,7 @@
           <w:rFonts w:ascii="Times New Roman" w:hAnsi="Times New Roman"/>
           <w:sz w:val="24"/>
         </w:rPr>
-        <w:t>Efron B, Morris C. Stein's estimation rule and its competitors: an empirical Bayes approach. J Am Stat Assoc 1973;68:117-30.</w:t>
+        <w:t>Seabold S, Perktold J. Statsmodels: econometric and statistical modeling with Python. In: Proceedings of the 9th Python in Science Conference. 2010:92-6.</w:t>
       </w:r>
     </w:p>
     <w:p>
@@ -3326,7 +3326,7 @@
           <w:rFonts w:ascii="Times New Roman" w:hAnsi="Times New Roman"/>
           <w:sz w:val="24"/>
         </w:rPr>
-        <w:t>Greenland S. Ecologic versus individual-level sources of bias in ecologic estimates of contextual health effects. Int J Epidemiol 2001;30:1343-50.</w:t>
+        <w:t>Efron B, Morris C. Stein's estimation rule and its competitors: an empirical Bayes approach. J Am Stat Assoc 1973;68:117-30.</w:t>
       </w:r>
     </w:p>
     <w:p>
@@ -3345,7 +3345,7 @@
           <w:rFonts w:ascii="Times New Roman" w:hAnsi="Times New Roman"/>
           <w:sz w:val="24"/>
         </w:rPr>
-        <w:t>Wennberg JE, Fisher ES, Skinner JS. Geography and the debate over Medicare reform. Health Aff (Millwood) 2002;Suppl Web Exclusives:W96-114.</w:t>
+        <w:t>Greenland S. Ecologic versus individual-level sources of bias in ecologic estimates of contextual health effects. Int J Epidemiol 2001;30:1343-50.</w:t>
       </w:r>
     </w:p>
     <w:p>
@@ -3364,7 +3364,7 @@
           <w:rFonts w:ascii="Times New Roman" w:hAnsi="Times New Roman"/>
           <w:sz w:val="24"/>
         </w:rPr>
-        <w:t>NHS RightCare. The NHS Atlas of Variation in Healthcare. London: Public Health England, 2015.</w:t>
+        <w:t>Wennberg JE, Fisher ES, Skinner JS. Geography and the debate over Medicare reform. Health Aff (Millwood) 2002;Suppl Web Exclusives:W96-114.</w:t>
       </w:r>
     </w:p>
     <w:p>
@@ -3383,7 +3383,7 @@
           <w:rFonts w:ascii="Times New Roman" w:hAnsi="Times New Roman"/>
           <w:sz w:val="24"/>
         </w:rPr>
-        <w:t>Wengler A, Nimptsch U, Mansky T. Hip and knee replacement surgery (arthroplasty) and geographic variations in Germany. Dtsch Arztebl Int 2014;111:407-16.</w:t>
+        <w:t>NHS RightCare. The NHS Atlas of Variation in Healthcare. London: Public Health England, 2015.</w:t>
       </w:r>
     </w:p>
     <w:p>
@@ -3402,7 +3402,7 @@
           <w:rFonts w:ascii="Times New Roman" w:hAnsi="Times New Roman"/>
           <w:sz w:val="24"/>
         </w:rPr>
-        <w:t>Australian Commission on Safety and Quality in Health Care. Australian Atlas of Healthcare Variation. Sydney: ACSQHC, 2015.</w:t>
+        <w:t>Schäfer T, Pritzkuleit R, Jeszenszky C, et al. Trends and geographical variation of primary hip and knee joint replacement in Germany. Osteoarthritis Cartilage 2013;21:279-88.</w:t>
       </w:r>
     </w:p>
     <w:p>
@@ -3421,7 +3421,7 @@
           <w:rFonts w:ascii="Times New Roman" w:hAnsi="Times New Roman"/>
           <w:sz w:val="24"/>
         </w:rPr>
-        <w:t>Otsuka T. The ikyoku system of university orthopaedic surgery departments: an in-hospital organisational system unique to Japan. J Orthop Sci 2012;17:513-14.</w:t>
+        <w:t>Australian Commission on Safety and Quality in Health Care. Australian Atlas of Healthcare Variation. Sydney: ACSQHC, 2015.</w:t>
       </w:r>
     </w:p>
     <w:p>
@@ -3440,7 +3440,7 @@
           <w:rFonts w:ascii="Times New Roman" w:hAnsi="Times New Roman"/>
           <w:sz w:val="24"/>
         </w:rPr>
-        <w:t>Cheng T-M. Taiwan's new national health insurance program: genesis and experience so far. Health Aff (Millwood) 2003;22:61-76.</w:t>
+        <w:t>Otsuka T. The ikyoku system of university orthopaedic surgery departments: an in-hospital organisational system unique to Japan. J Orthop Sci 2012;17:513-14.</w:t>
       </w:r>
     </w:p>
     <w:p>
@@ -3459,7 +3459,7 @@
           <w:rFonts w:ascii="Times New Roman" w:hAnsi="Times New Roman"/>
           <w:sz w:val="24"/>
         </w:rPr>
-        <w:t>OECD. Geographic Variations in Health Care: What Do We Know and What Can Be Done to Improve Health System Performance? Paris: OECD Publishing, 2014.</w:t>
+        <w:t>Cheng T-M. Taiwan's new national health insurance program: genesis and experience so far. Health Aff (Millwood) 2003;22:61-76.</w:t>
       </w:r>
     </w:p>
     <w:p>
@@ -3478,7 +3478,7 @@
           <w:rFonts w:ascii="Times New Roman" w:hAnsi="Times New Roman"/>
           <w:sz w:val="24"/>
         </w:rPr>
-        <w:t>Donabedian A. The quality of care: how can it be assessed? JAMA 1988;260:1743-8.</w:t>
+        <w:t>OECD. Geographic Variations in Health Care: What Do We Know and What Can Be Done to Improve Health System Performance? Paris: OECD Publishing, 2014.</w:t>
       </w:r>
     </w:p>
     <w:p>
@@ -3497,7 +3497,7 @@
           <w:rFonts w:ascii="Times New Roman" w:hAnsi="Times New Roman"/>
           <w:sz w:val="24"/>
         </w:rPr>
-        <w:t>Merry AF, Cooper JB, Soyannwo O, et al. International standards for a safe practice of anesthesia 2010. Can J Anesth 2010;57:1027-34.</w:t>
+        <w:t>Donabedian A. The quality of care: how can it be assessed? JAMA 1988;260:1743-8.</w:t>
       </w:r>
     </w:p>
     <w:p>
@@ -3516,7 +3516,7 @@
           <w:rFonts w:ascii="Times New Roman" w:hAnsi="Times New Roman"/>
           <w:sz w:val="24"/>
         </w:rPr>
-        <w:t>Mainz J. Defining and classifying clinical indicators for quality improvement. Int J Qual Health Care 2003;15:523-30.</w:t>
+        <w:t>Merry AF, Cooper JB, Soyannwo O, et al. International standards for a safe practice of anesthesia 2010. Can J Anesth 2010;57:1027-34.</w:t>
       </w:r>
     </w:p>
     <w:p>
@@ -3535,7 +3535,7 @@
           <w:rFonts w:ascii="Times New Roman" w:hAnsi="Times New Roman"/>
           <w:sz w:val="24"/>
         </w:rPr>
-        <w:t>von Elm E, Altman DG, Egger M, et al. The Strengthening the Reporting of Observational Studies in Epidemiology (STROBE) statement: guidelines for reporting observational studies. Lancet 2007;370:1453-7.</w:t>
+        <w:t>Mainz J. Defining and classifying clinical indicators for quality improvement. Int J Qual Health Care 2003;15:523-30.</w:t>
       </w:r>
     </w:p>
     <w:sectPr>

</xml_diff>

<commit_message>
IJHPM: add population density and anaesthesiologist share covariate sensitivity
Co-Authored-By: Tatsuki Onishi <bougtoir@gmail.com>
</commit_message>
<xml_diff>
--- a/documents/IJHPM/regional_anaesthesia_IJHPM_EN.docx
+++ b/documents/IJHPM/regional_anaesthesia_IJHPM_EN.docx
@@ -82,7 +82,7 @@
           <w:i/>
           <w:sz w:val="24"/>
         </w:rPr>
-        <w:t>Word count (main text, excluding abstract, references, tables and figures): approximately 3462 words</w:t>
+        <w:t>Word count (main text, excluding abstract, references, tables and figures): approximately 3662 words</w:t>
       </w:r>
     </w:p>
     <w:p>
@@ -635,7 +635,7 @@
           <w:rFonts w:ascii="Times New Roman" w:hAnsi="Times New Roman"/>
           <w:sz w:val="24"/>
         </w:rPr>
-        <w:t xml:space="preserve"> Third, geographic boundary data were obtained from the National Land Numerical Information dataset.</w:t>
+        <w:t xml:space="preserve"> Third, secondary medical area boundaries, land area and population density were obtained from the National Land Numerical Information medical-area dataset (A38-20).</w:t>
       </w:r>
       <w:r>
         <w:rPr>
@@ -1087,7 +1087,22 @@
           <w:rFonts w:ascii="Times New Roman" w:hAnsi="Times New Roman"/>
           <w:sz w:val="24"/>
         </w:rPr>
-        <w:t xml:space="preserve"> A null random-intercept model was fitted first to estimate the intraclass correlation coefficient. Subsequent models added fixed effects for university hospital presence. Models were estimated by restricted maximum likelihood using the Python statsmodels MixedLM implementation.</w:t>
+        <w:t xml:space="preserve"> A null random-intercept model was fitted first to estimate the intraclass correlation coefficient. Subsequent models added fixed effects for university hospital presence; a covariate-adjusted sensitivity model further added the natural logarithm of population density and the anaesthesiologist share of all physicians (both standardised).</w:t>
+      </w:r>
+      <w:r>
+        <w:rPr>
+          <w:rFonts w:ascii="Times New Roman" w:hAnsi="Times New Roman"/>
+          <w:sz w:val="24"/>
+          <w:vertAlign w:val="superscript"/>
+        </w:rPr>
+        <w:t>15,16</w:t>
+      </w:r>
+      <w:r>
+        <w:rPr>
+          <w:rFonts w:ascii="Times New Roman" w:hAnsi="Times New Roman"/>
+          <w:sz w:val="24"/>
+        </w:rPr>
+        <w:t xml:space="preserve"> Models were estimated by restricted maximum likelihood using the Python statsmodels MixedLM implementation.</w:t>
       </w:r>
       <w:r>
         <w:rPr>
@@ -1102,7 +1117,7 @@
           <w:rFonts w:ascii="Times New Roman" w:hAnsi="Times New Roman"/>
           <w:sz w:val="24"/>
         </w:rPr>
-        <w:t xml:space="preserve"> A small number of model fits produced optimizer convergence warnings; the resulting point estimates were numerically stable across repeated fits and across the three sensitivity analyses, and are reported as mixed-model coefficients. Marginal R² was calculated as the proportional reduction in total variance from the null model. To address potential instability of ratios in low-volume areas, we applied empirical Bayes shrinkage estimation</w:t>
+        <w:t xml:space="preserve"> A small number of model fits produced optimizer convergence warnings; the resulting point estimates were numerically stable across repeated fits and across the sensitivity analyses, and are reported as mixed-model coefficients. Marginal R² was calculated as the proportional reduction in total variance from the null model. To address potential instability of ratios in low-volume areas, we applied empirical Bayes shrinkage estimation</w:t>
       </w:r>
       <w:r>
         <w:rPr>
@@ -2487,6 +2502,15 @@
       </w:r>
     </w:p>
     <w:p>
+      <w:r>
+        <w:rPr>
+          <w:rFonts w:ascii="Times New Roman" w:hAnsi="Times New Roman"/>
+          <w:sz w:val="24"/>
+        </w:rPr>
+        <w:t>A covariate-adjusted sensitivity model added the natural logarithm of population density and the anaesthesiologist share of all physicians (both standardised). The university hospital coefficient was attenuated but remained positive and statistically significant for general anaesthesia (β = +41.8, 95% CI 32.4 to 51.2, P &lt;0.001), epidural anaesthesia (β = +39.1, 95% CI 14.5 to 63.7, P 0.002) and continuous epidural infusion (β = +33.9, 95% CI 20.0 to 47.7, P &lt;0.001). For spinal anaesthesia the point estimate was positive but no longer statistically significant (β = +9.7, 95% CI -4.0 to 23.3, P 0.165). Population density was positively associated with general anaesthesia ratios (β = 8.3, P &lt;0.001) but not with the other three codes. The anaesthesiologist share was positively associated with general, epidural, continuous epidural and spinal anaesthesia (P &lt;0.001, 0.039, &lt;0.001 and 0.005, respectively).</w:t>
+      </w:r>
+    </w:p>
+    <w:p>
       <w:pPr>
         <w:spacing w:before="240" w:after="120"/>
       </w:pPr>
@@ -2656,7 +2680,7 @@
           <w:rFonts w:ascii="Times New Roman" w:hAnsi="Times New Roman"/>
           <w:sz w:val="24"/>
         </w:rPr>
-        <w:t xml:space="preserve"> the cross-sectional design, which precludes causal inference; the post-audit nature of the data, which reflects reimbursed rather than intended practice; the partial overlap between university hospital presence and urban concentration; the absence of code-specific audit-rate data; and the inability to quantify defensive undercoding from claims alone. A specific constraint of the publicly available dataset is that the combined anaesthesia add-on billed under L008 (the explicit code for general-plus-epidural technique) is aggregated with other anaesthesia add-ons in the regional variation data release and cannot be extracted separately at the secondary-medical-area level; patient-level National Database records would be required to measure the true rate of combined general-epidural anaesthesia. We therefore used L002 (epidural as main technique) and L003 (continuous epidural infusion) as the publicly reported proxies for regional technique use. Multilevel models included only university hospital presence as a structural fixed effect; future work should add additional area-level covariates such as urbanisation, bed density and case-mix indicators.</w:t>
+        <w:t xml:space="preserve"> the cross-sectional design, which precludes causal inference; the post-audit nature of the data, which reflects reimbursed rather than intended practice; the partial overlap between university hospital presence and urban concentration; the absence of code-specific audit-rate data; and the inability to quantify defensive undercoding from claims alone. A specific constraint of the publicly available dataset is that the combined anaesthesia add-on billed under L008 (the explicit code for general-plus-epidural technique) is aggregated with other anaesthesia add-ons in the regional variation data release and cannot be extracted separately at the secondary-medical-area level; patient-level National Database records would be required to measure the true rate of combined general-epidural anaesthesia. We therefore used L002 (epidural as main technique) and L003 (continuous epidural infusion) as the publicly reported proxies for regional technique use. A covariate-adjusted sensitivity model added population density and anaesthesiologist supply; the university hospital coefficient remained positive and statistically significant for general, epidural and continuous epidural anaesthesia, but not for spinal anaesthesia, suggesting that unmeasured area-level factors still contribute to variation.</w:t>
       </w:r>
     </w:p>
     <w:p>

</xml_diff>

<commit_message>
IJHPM: clarify directional but underpowered spinal-anaesthesia university effect
Co-Authored-By: Tatsuki Onishi <bougtoir@gmail.com>
</commit_message>
<xml_diff>
--- a/documents/IJHPM/regional_anaesthesia_IJHPM_EN.docx
+++ b/documents/IJHPM/regional_anaesthesia_IJHPM_EN.docx
@@ -82,7 +82,7 @@
           <w:i/>
           <w:sz w:val="24"/>
         </w:rPr>
-        <w:t>Word count (main text, excluding abstract, references, tables and figures): approximately 3662 words</w:t>
+        <w:t>Word count (main text, excluding abstract, references, tables and figures): approximately 3683 words</w:t>
       </w:r>
     </w:p>
     <w:p>
@@ -2680,7 +2680,7 @@
           <w:rFonts w:ascii="Times New Roman" w:hAnsi="Times New Roman"/>
           <w:sz w:val="24"/>
         </w:rPr>
-        <w:t xml:space="preserve"> the cross-sectional design, which precludes causal inference; the post-audit nature of the data, which reflects reimbursed rather than intended practice; the partial overlap between university hospital presence and urban concentration; the absence of code-specific audit-rate data; and the inability to quantify defensive undercoding from claims alone. A specific constraint of the publicly available dataset is that the combined anaesthesia add-on billed under L008 (the explicit code for general-plus-epidural technique) is aggregated with other anaesthesia add-ons in the regional variation data release and cannot be extracted separately at the secondary-medical-area level; patient-level National Database records would be required to measure the true rate of combined general-epidural anaesthesia. We therefore used L002 (epidural as main technique) and L003 (continuous epidural infusion) as the publicly reported proxies for regional technique use. A covariate-adjusted sensitivity model added population density and anaesthesiologist supply; the university hospital coefficient remained positive and statistically significant for general, epidural and continuous epidural anaesthesia, but not for spinal anaesthesia, suggesting that unmeasured area-level factors still contribute to variation.</w:t>
+        <w:t xml:space="preserve"> the cross-sectional design, which precludes causal inference; the post-audit nature of the data, which reflects reimbursed rather than intended practice; the partial overlap between university hospital presence and urban concentration; the absence of code-specific audit-rate data; and the inability to quantify defensive undercoding from claims alone. A specific constraint of the publicly available dataset is that the combined anaesthesia add-on billed under L008 (the explicit code for general-plus-epidural technique) is aggregated with other anaesthesia add-ons in the regional variation data release and cannot be extracted separately at the secondary-medical-area level; patient-level National Database records would be required to measure the true rate of combined general-epidural anaesthesia. We therefore used L002 (epidural as main technique) and L003 (continuous epidural infusion) as the publicly reported proxies for regional technique use. A covariate-adjusted sensitivity model added population density and anaesthesiologist supply; the university hospital coefficient remained positive and statistically significant for general, epidural and continuous epidural anaesthesia, but not for spinal anaesthesia. The positive point estimate for spinal anaesthesia is, however, compatible with the same structural gradient operating in an underpowered model, and suggests that unmeasured area-level factors still contribute to variation.</w:t>
       </w:r>
     </w:p>
     <w:p>

</xml_diff>

<commit_message>
IJHPM: discuss countervailing mechanism for spinal-anaesthesia L004 estimate
Co-Authored-By: Tatsuki Onishi <bougtoir@gmail.com>
</commit_message>
<xml_diff>
--- a/documents/IJHPM/regional_anaesthesia_IJHPM_EN.docx
+++ b/documents/IJHPM/regional_anaesthesia_IJHPM_EN.docx
@@ -82,7 +82,7 @@
           <w:i/>
           <w:sz w:val="24"/>
         </w:rPr>
-        <w:t>Word count (main text, excluding abstract, references, tables and figures): approximately 3683 words</w:t>
+        <w:t>Word count (main text, excluding abstract, references, tables and figures): approximately 3714 words</w:t>
       </w:r>
     </w:p>
     <w:p>
@@ -2680,7 +2680,7 @@
           <w:rFonts w:ascii="Times New Roman" w:hAnsi="Times New Roman"/>
           <w:sz w:val="24"/>
         </w:rPr>
-        <w:t xml:space="preserve"> the cross-sectional design, which precludes causal inference; the post-audit nature of the data, which reflects reimbursed rather than intended practice; the partial overlap between university hospital presence and urban concentration; the absence of code-specific audit-rate data; and the inability to quantify defensive undercoding from claims alone. A specific constraint of the publicly available dataset is that the combined anaesthesia add-on billed under L008 (the explicit code for general-plus-epidural technique) is aggregated with other anaesthesia add-ons in the regional variation data release and cannot be extracted separately at the secondary-medical-area level; patient-level National Database records would be required to measure the true rate of combined general-epidural anaesthesia. We therefore used L002 (epidural as main technique) and L003 (continuous epidural infusion) as the publicly reported proxies for regional technique use. A covariate-adjusted sensitivity model added population density and anaesthesiologist supply; the university hospital coefficient remained positive and statistically significant for general, epidural and continuous epidural anaesthesia, but not for spinal anaesthesia. The positive point estimate for spinal anaesthesia is, however, compatible with the same structural gradient operating in an underpowered model, and suggests that unmeasured area-level factors still contribute to variation.</w:t>
+        <w:t xml:space="preserve"> the cross-sectional design, which precludes causal inference; the post-audit nature of the data, which reflects reimbursed rather than intended practice; the partial overlap between university hospital presence and urban concentration; the absence of code-specific audit-rate data; and the inability to quantify defensive undercoding from claims alone. A specific constraint of the publicly available dataset is that the combined anaesthesia add-on billed under L008 (the explicit code for general-plus-epidural technique) is aggregated with other anaesthesia add-ons in the regional variation data release and cannot be extracted separately at the secondary-medical-area level; patient-level National Database records would be required to measure the true rate of combined general-epidural anaesthesia. We therefore used L002 (epidural as main technique) and L003 (continuous epidural infusion) as the publicly reported proxies for regional technique use. A covariate-adjusted sensitivity model added population density and anaesthesiologist supply; the university hospital coefficient remained positive and statistically significant for general, epidural and continuous epidural anaesthesia, but not for spinal anaesthesia. The positive point estimate for spinal anaesthesia is, however, compatible with the same structural gradient operating in an underpowered model, and may partly reflect a countervailing tendency for neuraxial anaesthesia to be used in settings where anaesthesiologists are less available. The aggregate data cannot separate these opposing mechanisms, so the adjusted spinal-anaesthesia coefficient is best interpreted as an imprecise net effect.</w:t>
       </w:r>
     </w:p>
     <w:p>

</xml_diff>